<commit_message>
fix: stop the ngrok agent lingering and blocking future tunnels
Ngrok failed to start with ERR_NGROK_334 because a stale agent from a
previous run still held the reserved domain. A reserved domain can only
be claimed by one agent at a time.

Causes addressed:
- the Flask reloader spawns a parent and child process; only the child
  (WERKZEUG_RUN_MAIN=true) now starts a tunnel
- the agent was never cleaned up on exit, so kill/pkill orphaned it
- atexit alone is insufficient because it does not run on SIGTERM or
  SIGINT, which is how a server is normally stopped; added explicit
  signal handlers
- start_ngrok_tunnel now disconnects tunnels left by a previous run
- ERR_NGROK_334 and auth failures now print an actionable message
  instead of a raw stack trace

Document the tunnel lifecycle and the port 4040 diagnostics API in the
technical documentation, and the recovery steps in the README.
</commit_message>
<xml_diff>
--- a/docs/TECHNICAL_DOCUMENTATION.docx
+++ b/docs/TECHNICAL_DOCUMENTATION.docx
@@ -16951,18 +16951,113 @@
     </w:p>
     <w:p>
       <w:pPr>
-        <w:spacing w:before="80" w:after="160"/>
-        <w:pBdr>
-          <w:bottom w:val="single" w:sz="6" w:color="DCE5DF"/>
-        </w:pBdr>
-      </w:pPr>
-    </w:p>
-    <w:p>
-      <w:pPr>
-        <w:pStyle w:val="Heading2"/>
-      </w:pPr>
-      <w:r>
-        <w:t>19. Troubleshooting for Developers</w:t>
+        <w:pStyle w:val="Heading3"/>
+      </w:pPr>
+      <w:r>
+        <w:t>18.1 The ngrok tunnel lifecycle</w:t>
+      </w:r>
+    </w:p>
+    <w:p>
+      <w:r>
+        <w:t xml:space="preserve">Ngrok support is optional and off by default. When enabled, the tunnel is started from </w:t>
+      </w:r>
+      <w:r>
+        <w:rPr>
+          <w:rFonts w:ascii="Consolas" w:hAnsi="Consolas"/>
+          <w:sz w:val="19"/>
+          <w:rFonts w:ascii="Consolas" w:hAnsi="Consolas"/>
+          <w:shd w:val="clear" w:color="auto" w:fill="F4F7F5"/>
+        </w:rPr>
+        <w:t>__main__</w:t>
+      </w:r>
+      <w:r>
+        <w:t xml:space="preserve"> and the agent must be cleaned up when the process ends.</w:t>
+      </w:r>
+    </w:p>
+    <w:p>
+      <w:r>
+        <w:rPr>
+          <w:b/>
+        </w:rPr>
+        <w:t>The failure mode.</w:t>
+      </w:r>
+      <w:r>
+        <w:t xml:space="preserve"> A reserved ngrok domain can be claimed by only </w:t>
+      </w:r>
+      <w:r>
+        <w:rPr>
+          <w:b/>
+        </w:rPr>
+        <w:t>one agent at a time</w:t>
+      </w:r>
+      <w:r>
+        <w:t>. If a previous run's agent is still alive, the next start fails:</w:t>
+      </w:r>
+    </w:p>
+    <w:p>
+      <w:pPr>
+        <w:spacing w:before="120" w:after="120"/>
+        <w:ind w:left="259"/>
+        <w:shd w:val="clear" w:color="auto" w:fill="F4F7F5"/>
+      </w:pPr>
+      <w:r>
+        <w:rPr>
+          <w:rFonts w:ascii="Consolas" w:hAnsi="Consolas"/>
+          <w:sz w:val="18"/>
+          <w:rFonts w:ascii="Consolas" w:hAnsi="Consolas"/>
+        </w:rPr>
+        <w:t>ERR_NGROK_334: The endpoint 'https://…ngrok-free.dev' is already online.</w:t>
+      </w:r>
+    </w:p>
+    <w:p>
+      <w:pPr>
+        <w:spacing w:after="0"/>
+      </w:pPr>
+    </w:p>
+    <w:p>
+      <w:r>
+        <w:t xml:space="preserve">This is easy to trigger: the Flask reloader spawns a parent and a child process, so a naive implementation starts </w:t>
+      </w:r>
+      <w:r>
+        <w:rPr>
+          <w:b/>
+        </w:rPr>
+        <w:t>two</w:t>
+      </w:r>
+      <w:r>
+        <w:t xml:space="preserve"> agents, and a server stopped with </w:t>
+      </w:r>
+      <w:r>
+        <w:rPr>
+          <w:rFonts w:ascii="Consolas" w:hAnsi="Consolas"/>
+          <w:sz w:val="19"/>
+          <w:rFonts w:ascii="Consolas" w:hAnsi="Consolas"/>
+          <w:shd w:val="clear" w:color="auto" w:fill="F4F7F5"/>
+        </w:rPr>
+        <w:t>kill</w:t>
+      </w:r>
+      <w:r>
+        <w:t xml:space="preserve"> or </w:t>
+      </w:r>
+      <w:r>
+        <w:rPr>
+          <w:rFonts w:ascii="Consolas" w:hAnsi="Consolas"/>
+          <w:sz w:val="19"/>
+          <w:rFonts w:ascii="Consolas" w:hAnsi="Consolas"/>
+          <w:shd w:val="clear" w:color="auto" w:fill="F4F7F5"/>
+        </w:rPr>
+        <w:t>pkill</w:t>
+      </w:r>
+      <w:r>
+        <w:t xml:space="preserve"> leaves its agent orphaned.</w:t>
+      </w:r>
+    </w:p>
+    <w:p>
+      <w:r>
+        <w:rPr>
+          <w:b/>
+        </w:rPr>
+        <w:t>How the current code handles it:</w:t>
       </w:r>
     </w:p>
     <w:tbl>
@@ -16996,7 +17091,7 @@
                 <w:color w:val="FFFFFF"/>
                 <w:sz w:val="19"/>
               </w:rPr>
-              <w:t>Symptom</w:t>
+              <w:t>Concern</w:t>
             </w:r>
           </w:p>
         </w:tc>
@@ -17019,7 +17114,7 @@
                 <w:color w:val="FFFFFF"/>
                 <w:sz w:val="19"/>
               </w:rPr>
-              <w:t>Likely cause</w:t>
+              <w:t>Handling</w:t>
             </w:r>
           </w:p>
         </w:tc>
@@ -17039,7 +17134,7 @@
               <w:rPr>
                 <w:sz w:val="19"/>
               </w:rPr>
-              <w:t>Data changes in one script but not the running app</w:t>
+              <w:t>Duplicate agents from the reloader</w:t>
             </w:r>
           </w:p>
         </w:tc>
@@ -17057,7 +17152,7 @@
               <w:rPr>
                 <w:sz w:val="19"/>
               </w:rPr>
-              <w:t xml:space="preserve">Two databases — see §9. Check </w:t>
+              <w:t>Only the child (</w:t>
             </w:r>
             <w:r>
               <w:rPr>
@@ -17066,18 +17161,36 @@
                 <w:rFonts w:ascii="Consolas" w:hAnsi="Consolas"/>
                 <w:shd w:val="clear" w:color="auto" w:fill="F4F7F5"/>
               </w:rPr>
-              <w:t>app.instance_path</w:t>
-            </w:r>
-            <w:r>
-              <w:rPr>
-                <w:sz w:val="19"/>
-              </w:rPr>
-              <w:t>.</w:t>
+              <w:t>WERKZEUG_RUN_MAIN=true</w:t>
+            </w:r>
+            <w:r>
+              <w:rPr>
+                <w:sz w:val="19"/>
+              </w:rPr>
+              <w:t>) starts a tunnel</w:t>
             </w:r>
           </w:p>
         </w:tc>
       </w:tr>
       <w:tr>
+        <w:tc>
+          <w:tcPr>
+            <w:tcW w:type="dxa" w:w="4824"/>
+          </w:tcPr>
+          <w:p>
+            <w:r>
+              <w:rPr>
+                <w:sz w:val="19"/>
+              </w:rPr>
+            </w:r>
+            <w:r>
+              <w:rPr>
+                <w:sz w:val="19"/>
+              </w:rPr>
+              <w:t>Tunnels left by a previous run</w:t>
+            </w:r>
+          </w:p>
+        </w:tc>
         <w:tc>
           <w:tcPr>
             <w:tcW w:type="dxa" w:w="4824"/>
@@ -17095,10 +17208,18 @@
                 <w:rFonts w:ascii="Consolas" w:hAnsi="Consolas"/>
                 <w:shd w:val="clear" w:color="auto" w:fill="F4F7F5"/>
               </w:rPr>
-              <w:t>Port 5100 is in use</w:t>
-            </w:r>
-          </w:p>
-        </w:tc>
+              <w:t>start_ngrok_tunnel</w:t>
+            </w:r>
+            <w:r>
+              <w:rPr>
+                <w:sz w:val="19"/>
+              </w:rPr>
+              <w:t xml:space="preserve"> disconnects existing tunnels first</w:t>
+            </w:r>
+          </w:p>
+        </w:tc>
+      </w:tr>
+      <w:tr>
         <w:tc>
           <w:tcPr>
             <w:tcW w:type="dxa" w:w="4824"/>
@@ -17113,7 +17234,19 @@
               <w:rPr>
                 <w:sz w:val="19"/>
               </w:rPr>
-              <w:t xml:space="preserve">Another instance is running. Set </w:t>
+              <w:t>Clean exit</w:t>
+            </w:r>
+          </w:p>
+        </w:tc>
+        <w:tc>
+          <w:tcPr>
+            <w:tcW w:type="dxa" w:w="4824"/>
+          </w:tcPr>
+          <w:p>
+            <w:r>
+              <w:rPr>
+                <w:sz w:val="19"/>
+              </w:rPr>
             </w:r>
             <w:r>
               <w:rPr>
@@ -17122,13 +17255,13 @@
                 <w:rFonts w:ascii="Consolas" w:hAnsi="Consolas"/>
                 <w:shd w:val="clear" w:color="auto" w:fill="F4F7F5"/>
               </w:rPr>
-              <w:t>PORT=5199</w:t>
-            </w:r>
-            <w:r>
-              <w:rPr>
-                <w:sz w:val="19"/>
-              </w:rPr>
-              <w:t>.</w:t>
+              <w:t>atexit</w:t>
+            </w:r>
+            <w:r>
+              <w:rPr>
+                <w:sz w:val="19"/>
+              </w:rPr>
+              <w:t xml:space="preserve"> handler</w:t>
             </w:r>
           </w:p>
         </w:tc>
@@ -17151,13 +17284,13 @@
                 <w:rFonts w:ascii="Consolas" w:hAnsi="Consolas"/>
                 <w:shd w:val="clear" w:color="auto" w:fill="F4F7F5"/>
               </w:rPr>
-              <w:t>favicon.ico</w:t>
-            </w:r>
-            <w:r>
-              <w:rPr>
-                <w:sz w:val="19"/>
-              </w:rPr>
-              <w:t xml:space="preserve"> 404 in </w:t>
+              <w:t>SIGTERM</w:t>
+            </w:r>
+            <w:r>
+              <w:rPr>
+                <w:sz w:val="19"/>
+              </w:rPr>
+              <w:t xml:space="preserve"> / </w:t>
             </w:r>
             <w:r>
               <w:rPr>
@@ -17166,31 +17299,13 @@
                 <w:rFonts w:ascii="Consolas" w:hAnsi="Consolas"/>
                 <w:shd w:val="clear" w:color="auto" w:fill="F4F7F5"/>
               </w:rPr>
-              <w:t>base.html</w:t>
-            </w:r>
-            <w:r>
-              <w:rPr>
-                <w:sz w:val="19"/>
-              </w:rPr>
-              <w:t xml:space="preserve"> pages</w:t>
-            </w:r>
-          </w:p>
-        </w:tc>
-        <w:tc>
-          <w:tcPr>
-            <w:tcW w:type="dxa" w:w="4824"/>
-          </w:tcPr>
-          <w:p>
-            <w:r>
-              <w:rPr>
-                <w:sz w:val="19"/>
-              </w:rPr>
-            </w:r>
-            <w:r>
-              <w:rPr>
-                <w:sz w:val="19"/>
-              </w:rPr>
-              <w:t xml:space="preserve">Expected; only </w:t>
+              <w:t>SIGINT</w:t>
+            </w:r>
+            <w:r>
+              <w:rPr>
+                <w:sz w:val="19"/>
+              </w:rPr>
+              <w:t xml:space="preserve"> (Ctrl+C, </w:t>
             </w:r>
             <w:r>
               <w:rPr>
@@ -17199,27 +17314,13 @@
                 <w:rFonts w:ascii="Consolas" w:hAnsi="Consolas"/>
                 <w:shd w:val="clear" w:color="auto" w:fill="F4F7F5"/>
               </w:rPr>
-              <w:t>login.html</w:t>
-            </w:r>
-            <w:r>
-              <w:rPr>
-                <w:sz w:val="19"/>
-              </w:rPr>
-              <w:t xml:space="preserve"> declares an icon</w:t>
-            </w:r>
-          </w:p>
-        </w:tc>
-      </w:tr>
-      <w:tr>
-        <w:tc>
-          <w:tcPr>
-            <w:tcW w:type="dxa" w:w="4824"/>
-          </w:tcPr>
-          <w:p>
-            <w:r>
-              <w:rPr>
-                <w:sz w:val="19"/>
-              </w:rPr>
+              <w:t>kill</w:t>
+            </w:r>
+            <w:r>
+              <w:rPr>
+                <w:sz w:val="19"/>
+              </w:rPr>
+              <w:t xml:space="preserve">, </w:t>
             </w:r>
             <w:r>
               <w:rPr>
@@ -17228,7 +17329,13 @@
                 <w:rFonts w:ascii="Consolas" w:hAnsi="Consolas"/>
                 <w:shd w:val="clear" w:color="auto" w:fill="F4F7F5"/>
               </w:rPr>
-              <w:t>DeprecationWarning: datetime.utcnow()</w:t>
+              <w:t>pkill</w:t>
+            </w:r>
+            <w:r>
+              <w:rPr>
+                <w:sz w:val="19"/>
+              </w:rPr>
+              <w:t>)</w:t>
             </w:r>
           </w:p>
         </w:tc>
@@ -17246,39 +17353,7 @@
               <w:rPr>
                 <w:sz w:val="19"/>
               </w:rPr>
-              <w:t>Python 3.12; see limitations</w:t>
-            </w:r>
-          </w:p>
-        </w:tc>
-      </w:tr>
-      <w:tr>
-        <w:tc>
-          <w:tcPr>
-            <w:tcW w:type="dxa" w:w="4824"/>
-          </w:tcPr>
-          <w:p>
-            <w:r>
-              <w:rPr>
-                <w:sz w:val="19"/>
-              </w:rPr>
-            </w:r>
-            <w:r>
-              <w:rPr>
-                <w:sz w:val="19"/>
-              </w:rPr>
-              <w:t>Tables missing after a schema change</w:t>
-            </w:r>
-          </w:p>
-        </w:tc>
-        <w:tc>
-          <w:tcPr>
-            <w:tcW w:type="dxa" w:w="4824"/>
-          </w:tcPr>
-          <w:p>
-            <w:r>
-              <w:rPr>
-                <w:sz w:val="19"/>
-              </w:rPr>
+              <w:t xml:space="preserve">Explicit signal handlers — </w:t>
             </w:r>
             <w:r>
               <w:rPr>
@@ -17287,26 +17362,26 @@
                 <w:rFonts w:ascii="Consolas" w:hAnsi="Consolas"/>
                 <w:shd w:val="clear" w:color="auto" w:fill="F4F7F5"/>
               </w:rPr>
-              <w:t>migrate_database()</w:t>
-            </w:r>
-            <w:r>
-              <w:rPr>
-                <w:sz w:val="19"/>
-              </w:rPr>
-              <w:t xml:space="preserve"> only </w:t>
-            </w:r>
-            <w:r>
-              <w:rPr>
-                <w:i/>
-                <w:sz w:val="19"/>
-              </w:rPr>
-              <w:t>adds</w:t>
-            </w:r>
-            <w:r>
-              <w:rPr>
-                <w:sz w:val="19"/>
-              </w:rPr>
-              <w:t xml:space="preserve"> columns</w:t>
+              <w:t>atexit</w:t>
+            </w:r>
+            <w:r>
+              <w:rPr>
+                <w:sz w:val="19"/>
+              </w:rPr>
+              <w:t xml:space="preserve"> does </w:t>
+            </w:r>
+            <w:r>
+              <w:rPr>
+                <w:b/>
+                <w:sz w:val="19"/>
+              </w:rPr>
+              <w:t>not</w:t>
+            </w:r>
+            <w:r>
+              <w:rPr>
+                <w:sz w:val="19"/>
+              </w:rPr>
+              <w:t xml:space="preserve"> run on signals</w:t>
             </w:r>
           </w:p>
         </w:tc>
@@ -17326,7 +17401,7 @@
               <w:rPr>
                 <w:sz w:val="19"/>
               </w:rPr>
-              <w:t>QR image not updating</w:t>
+              <w:t>Unhelpful raw errors</w:t>
             </w:r>
           </w:p>
         </w:tc>
@@ -17339,12 +17414,6 @@
               <w:rPr>
                 <w:sz w:val="19"/>
               </w:rPr>
-            </w:r>
-            <w:r>
-              <w:rPr>
-                <w:sz w:val="19"/>
-              </w:rPr>
-              <w:t xml:space="preserve">Old </w:t>
             </w:r>
             <w:r>
               <w:rPr>
@@ -17353,13 +17422,335 @@
                 <w:rFonts w:ascii="Consolas" w:hAnsi="Consolas"/>
                 <w:shd w:val="clear" w:color="auto" w:fill="F4F7F5"/>
               </w:rPr>
-              <w:t>visit_*.png</w:t>
-            </w:r>
-            <w:r>
-              <w:rPr>
-                <w:sz w:val="19"/>
-              </w:rPr>
-              <w:t xml:space="preserve"> files persist in </w:t>
+              <w:t>ERR_NGROK_334</w:t>
+            </w:r>
+            <w:r>
+              <w:rPr>
+                <w:sz w:val="19"/>
+              </w:rPr>
+              <w:t xml:space="preserve"> and auth failures print an actionable message</w:t>
+            </w:r>
+          </w:p>
+        </w:tc>
+      </w:tr>
+    </w:tbl>
+    <w:p>
+      <w:pPr>
+        <w:spacing w:after="0"/>
+      </w:pPr>
+    </w:p>
+    <w:p>
+      <w:pPr>
+        <w:spacing w:before="120" w:after="200"/>
+        <w:ind w:left="432"/>
+        <w:pBdr>
+          <w:left w:val="single" w:sz="18" w:color="D9A441"/>
+        </w:pBdr>
+        <w:shd w:val="clear" w:color="auto" w:fill="F4F7F5"/>
+      </w:pPr>
+      <w:r>
+        <w:rPr>
+          <w:b/>
+        </w:rPr>
+        <w:t>Why signal handlers are required:</w:t>
+      </w:r>
+      <w:r>
+        <w:t xml:space="preserve"> </w:t>
+      </w:r>
+      <w:r>
+        <w:rPr>
+          <w:rFonts w:ascii="Consolas" w:hAnsi="Consolas"/>
+          <w:sz w:val="19"/>
+          <w:rFonts w:ascii="Consolas" w:hAnsi="Consolas"/>
+          <w:shd w:val="clear" w:color="auto" w:fill="F4F7F5"/>
+        </w:rPr>
+        <w:t>atexit</w:t>
+      </w:r>
+      <w:r>
+        <w:t xml:space="preserve"> only runs on normal interpreter shutdown. A server is almost always stopped with a signal, so relying on </w:t>
+      </w:r>
+      <w:r>
+        <w:rPr>
+          <w:rFonts w:ascii="Consolas" w:hAnsi="Consolas"/>
+          <w:sz w:val="19"/>
+          <w:rFonts w:ascii="Consolas" w:hAnsi="Consolas"/>
+          <w:shd w:val="clear" w:color="auto" w:fill="F4F7F5"/>
+        </w:rPr>
+        <w:t>atexit</w:t>
+      </w:r>
+      <w:r>
+        <w:t xml:space="preserve"> alone leaves the agent running.</w:t>
+      </w:r>
+    </w:p>
+    <w:p>
+      <w:r>
+        <w:rPr>
+          <w:b/>
+        </w:rPr>
+        <w:t>If you still hit `ERR_NGROK_334`</w:t>
+      </w:r>
+      <w:r>
+        <w:t>, a foreign agent holds the domain:</w:t>
+      </w:r>
+    </w:p>
+    <w:p>
+      <w:pPr>
+        <w:spacing w:before="120" w:after="0"/>
+        <w:ind w:left="259"/>
+        <w:shd w:val="clear" w:color="auto" w:fill="F4F7F5"/>
+      </w:pPr>
+      <w:r>
+        <w:rPr>
+          <w:rFonts w:ascii="Consolas" w:hAnsi="Consolas"/>
+          <w:sz w:val="18"/>
+          <w:rFonts w:ascii="Consolas" w:hAnsi="Consolas"/>
+        </w:rPr>
+        <w:t>pkill -f ngrok</w:t>
+      </w:r>
+    </w:p>
+    <w:p>
+      <w:pPr>
+        <w:spacing w:before="0" w:after="0"/>
+        <w:ind w:left="259"/>
+        <w:shd w:val="clear" w:color="auto" w:fill="F4F7F5"/>
+      </w:pPr>
+      <w:r>
+        <w:rPr>
+          <w:rFonts w:ascii="Consolas" w:hAnsi="Consolas"/>
+          <w:sz w:val="18"/>
+          <w:rFonts w:ascii="Consolas" w:hAnsi="Consolas"/>
+        </w:rPr>
+        <w:t># confirm it is gone</w:t>
+      </w:r>
+    </w:p>
+    <w:p>
+      <w:pPr>
+        <w:spacing w:before="0" w:after="0"/>
+        <w:ind w:left="259"/>
+        <w:shd w:val="clear" w:color="auto" w:fill="F4F7F5"/>
+      </w:pPr>
+      <w:r>
+        <w:rPr>
+          <w:rFonts w:ascii="Consolas" w:hAnsi="Consolas"/>
+          <w:sz w:val="18"/>
+          <w:rFonts w:ascii="Consolas" w:hAnsi="Consolas"/>
+        </w:rPr>
+        <w:t>ps aux | grep "[n]grok"</w:t>
+      </w:r>
+    </w:p>
+    <w:p>
+      <w:pPr>
+        <w:spacing w:before="0" w:after="0"/>
+        <w:ind w:left="259"/>
+        <w:shd w:val="clear" w:color="auto" w:fill="F4F7F5"/>
+      </w:pPr>
+      <w:r>
+        <w:rPr>
+          <w:rFonts w:ascii="Consolas" w:hAnsi="Consolas"/>
+          <w:sz w:val="18"/>
+          <w:rFonts w:ascii="Consolas" w:hAnsi="Consolas"/>
+        </w:rPr>
+        <w:t># the local agent API should also be free</w:t>
+      </w:r>
+    </w:p>
+    <w:p>
+      <w:pPr>
+        <w:spacing w:before="0" w:after="120"/>
+        <w:ind w:left="259"/>
+        <w:shd w:val="clear" w:color="auto" w:fill="F4F7F5"/>
+      </w:pPr>
+      <w:r>
+        <w:rPr>
+          <w:rFonts w:ascii="Consolas" w:hAnsi="Consolas"/>
+          <w:sz w:val="18"/>
+          <w:rFonts w:ascii="Consolas" w:hAnsi="Consolas"/>
+        </w:rPr>
+        <w:t>ss -ltn | grep 4040</w:t>
+      </w:r>
+    </w:p>
+    <w:p>
+      <w:pPr>
+        <w:spacing w:after="0"/>
+      </w:pPr>
+    </w:p>
+    <w:p>
+      <w:r>
+        <w:rPr>
+          <w:b/>
+        </w:rPr>
+        <w:t>Diagnostics.</w:t>
+      </w:r>
+      <w:r>
+        <w:t xml:space="preserve"> The ngrok agent exposes a local API on port 4040:</w:t>
+      </w:r>
+    </w:p>
+    <w:p>
+      <w:pPr>
+        <w:spacing w:before="120" w:after="120"/>
+        <w:ind w:left="259"/>
+        <w:shd w:val="clear" w:color="auto" w:fill="F4F7F5"/>
+      </w:pPr>
+      <w:r>
+        <w:rPr>
+          <w:rFonts w:ascii="Consolas" w:hAnsi="Consolas"/>
+          <w:sz w:val="18"/>
+          <w:rFonts w:ascii="Consolas" w:hAnsi="Consolas"/>
+        </w:rPr>
+        <w:t>curl -s http://127.0.0.1:4040/api/tunnels</w:t>
+      </w:r>
+    </w:p>
+    <w:p>
+      <w:pPr>
+        <w:spacing w:after="0"/>
+      </w:pPr>
+    </w:p>
+    <w:p>
+      <w:r>
+        <w:t xml:space="preserve">This shows the live tunnel, its public URL, and — importantly — the </w:t>
+      </w:r>
+      <w:r>
+        <w:rPr>
+          <w:b/>
+        </w:rPr>
+        <w:t>local address it forwards to</w:t>
+      </w:r>
+      <w:r>
+        <w:t xml:space="preserve">. If that address points at a dead port (for example </w:t>
+      </w:r>
+      <w:r>
+        <w:rPr>
+          <w:rFonts w:ascii="Consolas" w:hAnsi="Consolas"/>
+          <w:sz w:val="19"/>
+          <w:rFonts w:ascii="Consolas" w:hAnsi="Consolas"/>
+          <w:shd w:val="clear" w:color="auto" w:fill="F4F7F5"/>
+        </w:rPr>
+        <w:t>localhost:5101</w:t>
+      </w:r>
+      <w:r>
+        <w:t xml:space="preserve"> while the app runs on </w:t>
+      </w:r>
+      <w:r>
+        <w:rPr>
+          <w:rFonts w:ascii="Consolas" w:hAnsi="Consolas"/>
+          <w:sz w:val="19"/>
+          <w:rFonts w:ascii="Consolas" w:hAnsi="Consolas"/>
+          <w:shd w:val="clear" w:color="auto" w:fill="F4F7F5"/>
+        </w:rPr>
+        <w:t>5100</w:t>
+      </w:r>
+      <w:r>
+        <w:t>), the tunnel will appear to work but every request will fail.</w:t>
+      </w:r>
+    </w:p>
+    <w:p>
+      <w:pPr>
+        <w:spacing w:before="80" w:after="160"/>
+        <w:pBdr>
+          <w:bottom w:val="single" w:sz="6" w:color="DCE5DF"/>
+        </w:pBdr>
+      </w:pPr>
+    </w:p>
+    <w:p>
+      <w:pPr>
+        <w:pStyle w:val="Heading2"/>
+      </w:pPr>
+      <w:r>
+        <w:t>19. Troubleshooting for Developers</w:t>
+      </w:r>
+    </w:p>
+    <w:tbl>
+      <w:tblPr>
+        <w:tblStyle w:val="TableGrid"/>
+        <w:tblW w:type="auto" w:w="0"/>
+        <w:jc w:val="center"/>
+        <w:tblLook w:firstColumn="1" w:firstRow="1" w:lastColumn="0" w:lastRow="0" w:noHBand="0" w:noVBand="1" w:val="04A0"/>
+      </w:tblPr>
+      <w:tblGrid>
+        <w:gridCol w:w="4824"/>
+        <w:gridCol w:w="4824"/>
+      </w:tblGrid>
+      <w:tr>
+        <w:tc>
+          <w:tcPr>
+            <w:tcW w:type="dxa" w:w="4824"/>
+            <w:shd w:val="clear" w:color="auto" w:fill="0F6F3F"/>
+          </w:tcPr>
+          <w:p>
+            <w:r>
+              <w:rPr>
+                <w:b/>
+                <w:color w:val="FFFFFF"/>
+                <w:sz w:val="19"/>
+              </w:rPr>
+            </w:r>
+            <w:r>
+              <w:rPr>
+                <w:b/>
+                <w:color w:val="FFFFFF"/>
+                <w:sz w:val="19"/>
+              </w:rPr>
+              <w:t>Symptom</w:t>
+            </w:r>
+          </w:p>
+        </w:tc>
+        <w:tc>
+          <w:tcPr>
+            <w:tcW w:type="dxa" w:w="4824"/>
+            <w:shd w:val="clear" w:color="auto" w:fill="0F6F3F"/>
+          </w:tcPr>
+          <w:p>
+            <w:r>
+              <w:rPr>
+                <w:b/>
+                <w:color w:val="FFFFFF"/>
+                <w:sz w:val="19"/>
+              </w:rPr>
+            </w:r>
+            <w:r>
+              <w:rPr>
+                <w:b/>
+                <w:color w:val="FFFFFF"/>
+                <w:sz w:val="19"/>
+              </w:rPr>
+              <w:t>Likely cause</w:t>
+            </w:r>
+          </w:p>
+        </w:tc>
+      </w:tr>
+      <w:tr>
+        <w:tc>
+          <w:tcPr>
+            <w:tcW w:type="dxa" w:w="4824"/>
+          </w:tcPr>
+          <w:p>
+            <w:r>
+              <w:rPr>
+                <w:sz w:val="19"/>
+              </w:rPr>
+            </w:r>
+            <w:r>
+              <w:rPr>
+                <w:sz w:val="19"/>
+              </w:rPr>
+              <w:t>Data changes in one script but not the running app</w:t>
+            </w:r>
+          </w:p>
+        </w:tc>
+        <w:tc>
+          <w:tcPr>
+            <w:tcW w:type="dxa" w:w="4824"/>
+          </w:tcPr>
+          <w:p>
+            <w:r>
+              <w:rPr>
+                <w:sz w:val="19"/>
+              </w:rPr>
+            </w:r>
+            <w:r>
+              <w:rPr>
+                <w:sz w:val="19"/>
+              </w:rPr>
+              <w:t xml:space="preserve">Two databases — see §9. Check </w:t>
             </w:r>
             <w:r>
               <w:rPr>
@@ -17368,7 +17759,13 @@
                 <w:rFonts w:ascii="Consolas" w:hAnsi="Consolas"/>
                 <w:shd w:val="clear" w:color="auto" w:fill="F4F7F5"/>
               </w:rPr>
-              <w:t>static/img/</w:t>
+              <w:t>app.instance_path</w:t>
+            </w:r>
+            <w:r>
+              <w:rPr>
+                <w:sz w:val="19"/>
+              </w:rPr>
+              <w:t>.</w:t>
             </w:r>
           </w:p>
         </w:tc>
@@ -17383,12 +17780,6 @@
               <w:rPr>
                 <w:sz w:val="19"/>
               </w:rPr>
-            </w:r>
-            <w:r>
-              <w:rPr>
-                <w:sz w:val="19"/>
-              </w:rPr>
-              <w:t xml:space="preserve">JS errors around </w:t>
             </w:r>
             <w:r>
               <w:rPr>
@@ -17397,13 +17788,7 @@
                 <w:rFonts w:ascii="Consolas" w:hAnsi="Consolas"/>
                 <w:shd w:val="clear" w:color="auto" w:fill="F4F7F5"/>
               </w:rPr>
-              <w:t>{% if %}</w:t>
-            </w:r>
-            <w:r>
-              <w:rPr>
-                <w:sz w:val="19"/>
-              </w:rPr>
-              <w:t xml:space="preserve"> in templates</w:t>
+              <w:t>Port 5100 is in use</w:t>
             </w:r>
           </w:p>
         </w:tc>
@@ -17421,45 +17806,7 @@
               <w:rPr>
                 <w:sz w:val="19"/>
               </w:rPr>
-              <w:t>The JS language server cannot parse Jinja; harmless</w:t>
-            </w:r>
-          </w:p>
-        </w:tc>
-      </w:tr>
-      <w:tr>
-        <w:tc>
-          <w:tcPr>
-            <w:tcW w:type="dxa" w:w="4824"/>
-          </w:tcPr>
-          <w:p>
-            <w:r>
-              <w:rPr>
-                <w:sz w:val="19"/>
-              </w:rPr>
-            </w:r>
-            <w:r>
-              <w:rPr>
-                <w:sz w:val="19"/>
-              </w:rPr>
-              <w:t>Login succeeds but lands somewhere unexpected</w:t>
-            </w:r>
-          </w:p>
-        </w:tc>
-        <w:tc>
-          <w:tcPr>
-            <w:tcW w:type="dxa" w:w="4824"/>
-          </w:tcPr>
-          <w:p>
-            <w:r>
-              <w:rPr>
-                <w:sz w:val="19"/>
-              </w:rPr>
-            </w:r>
-            <w:r>
-              <w:rPr>
-                <w:sz w:val="19"/>
-              </w:rPr>
-              <w:t xml:space="preserve">Check </w:t>
+              <w:t xml:space="preserve">Another instance is running. Set </w:t>
             </w:r>
             <w:r>
               <w:rPr>
@@ -17468,6 +17815,352 @@
                 <w:rFonts w:ascii="Consolas" w:hAnsi="Consolas"/>
                 <w:shd w:val="clear" w:color="auto" w:fill="F4F7F5"/>
               </w:rPr>
+              <w:t>PORT=5199</w:t>
+            </w:r>
+            <w:r>
+              <w:rPr>
+                <w:sz w:val="19"/>
+              </w:rPr>
+              <w:t>.</w:t>
+            </w:r>
+          </w:p>
+        </w:tc>
+      </w:tr>
+      <w:tr>
+        <w:tc>
+          <w:tcPr>
+            <w:tcW w:type="dxa" w:w="4824"/>
+          </w:tcPr>
+          <w:p>
+            <w:r>
+              <w:rPr>
+                <w:sz w:val="19"/>
+              </w:rPr>
+            </w:r>
+            <w:r>
+              <w:rPr>
+                <w:rFonts w:ascii="Consolas" w:hAnsi="Consolas"/>
+                <w:sz w:val="17"/>
+                <w:rFonts w:ascii="Consolas" w:hAnsi="Consolas"/>
+                <w:shd w:val="clear" w:color="auto" w:fill="F4F7F5"/>
+              </w:rPr>
+              <w:t>favicon.ico</w:t>
+            </w:r>
+            <w:r>
+              <w:rPr>
+                <w:sz w:val="19"/>
+              </w:rPr>
+              <w:t xml:space="preserve"> 404 in </w:t>
+            </w:r>
+            <w:r>
+              <w:rPr>
+                <w:rFonts w:ascii="Consolas" w:hAnsi="Consolas"/>
+                <w:sz w:val="17"/>
+                <w:rFonts w:ascii="Consolas" w:hAnsi="Consolas"/>
+                <w:shd w:val="clear" w:color="auto" w:fill="F4F7F5"/>
+              </w:rPr>
+              <w:t>base.html</w:t>
+            </w:r>
+            <w:r>
+              <w:rPr>
+                <w:sz w:val="19"/>
+              </w:rPr>
+              <w:t xml:space="preserve"> pages</w:t>
+            </w:r>
+          </w:p>
+        </w:tc>
+        <w:tc>
+          <w:tcPr>
+            <w:tcW w:type="dxa" w:w="4824"/>
+          </w:tcPr>
+          <w:p>
+            <w:r>
+              <w:rPr>
+                <w:sz w:val="19"/>
+              </w:rPr>
+            </w:r>
+            <w:r>
+              <w:rPr>
+                <w:sz w:val="19"/>
+              </w:rPr>
+              <w:t xml:space="preserve">Expected; only </w:t>
+            </w:r>
+            <w:r>
+              <w:rPr>
+                <w:rFonts w:ascii="Consolas" w:hAnsi="Consolas"/>
+                <w:sz w:val="17"/>
+                <w:rFonts w:ascii="Consolas" w:hAnsi="Consolas"/>
+                <w:shd w:val="clear" w:color="auto" w:fill="F4F7F5"/>
+              </w:rPr>
+              <w:t>login.html</w:t>
+            </w:r>
+            <w:r>
+              <w:rPr>
+                <w:sz w:val="19"/>
+              </w:rPr>
+              <w:t xml:space="preserve"> declares an icon</w:t>
+            </w:r>
+          </w:p>
+        </w:tc>
+      </w:tr>
+      <w:tr>
+        <w:tc>
+          <w:tcPr>
+            <w:tcW w:type="dxa" w:w="4824"/>
+          </w:tcPr>
+          <w:p>
+            <w:r>
+              <w:rPr>
+                <w:sz w:val="19"/>
+              </w:rPr>
+            </w:r>
+            <w:r>
+              <w:rPr>
+                <w:rFonts w:ascii="Consolas" w:hAnsi="Consolas"/>
+                <w:sz w:val="17"/>
+                <w:rFonts w:ascii="Consolas" w:hAnsi="Consolas"/>
+                <w:shd w:val="clear" w:color="auto" w:fill="F4F7F5"/>
+              </w:rPr>
+              <w:t>DeprecationWarning: datetime.utcnow()</w:t>
+            </w:r>
+          </w:p>
+        </w:tc>
+        <w:tc>
+          <w:tcPr>
+            <w:tcW w:type="dxa" w:w="4824"/>
+          </w:tcPr>
+          <w:p>
+            <w:r>
+              <w:rPr>
+                <w:sz w:val="19"/>
+              </w:rPr>
+            </w:r>
+            <w:r>
+              <w:rPr>
+                <w:sz w:val="19"/>
+              </w:rPr>
+              <w:t>Python 3.12; see limitations</w:t>
+            </w:r>
+          </w:p>
+        </w:tc>
+      </w:tr>
+      <w:tr>
+        <w:tc>
+          <w:tcPr>
+            <w:tcW w:type="dxa" w:w="4824"/>
+          </w:tcPr>
+          <w:p>
+            <w:r>
+              <w:rPr>
+                <w:sz w:val="19"/>
+              </w:rPr>
+            </w:r>
+            <w:r>
+              <w:rPr>
+                <w:sz w:val="19"/>
+              </w:rPr>
+              <w:t>Tables missing after a schema change</w:t>
+            </w:r>
+          </w:p>
+        </w:tc>
+        <w:tc>
+          <w:tcPr>
+            <w:tcW w:type="dxa" w:w="4824"/>
+          </w:tcPr>
+          <w:p>
+            <w:r>
+              <w:rPr>
+                <w:sz w:val="19"/>
+              </w:rPr>
+            </w:r>
+            <w:r>
+              <w:rPr>
+                <w:rFonts w:ascii="Consolas" w:hAnsi="Consolas"/>
+                <w:sz w:val="17"/>
+                <w:rFonts w:ascii="Consolas" w:hAnsi="Consolas"/>
+                <w:shd w:val="clear" w:color="auto" w:fill="F4F7F5"/>
+              </w:rPr>
+              <w:t>migrate_database()</w:t>
+            </w:r>
+            <w:r>
+              <w:rPr>
+                <w:sz w:val="19"/>
+              </w:rPr>
+              <w:t xml:space="preserve"> only </w:t>
+            </w:r>
+            <w:r>
+              <w:rPr>
+                <w:i/>
+                <w:sz w:val="19"/>
+              </w:rPr>
+              <w:t>adds</w:t>
+            </w:r>
+            <w:r>
+              <w:rPr>
+                <w:sz w:val="19"/>
+              </w:rPr>
+              <w:t xml:space="preserve"> columns</w:t>
+            </w:r>
+          </w:p>
+        </w:tc>
+      </w:tr>
+      <w:tr>
+        <w:tc>
+          <w:tcPr>
+            <w:tcW w:type="dxa" w:w="4824"/>
+          </w:tcPr>
+          <w:p>
+            <w:r>
+              <w:rPr>
+                <w:sz w:val="19"/>
+              </w:rPr>
+            </w:r>
+            <w:r>
+              <w:rPr>
+                <w:sz w:val="19"/>
+              </w:rPr>
+              <w:t>QR image not updating</w:t>
+            </w:r>
+          </w:p>
+        </w:tc>
+        <w:tc>
+          <w:tcPr>
+            <w:tcW w:type="dxa" w:w="4824"/>
+          </w:tcPr>
+          <w:p>
+            <w:r>
+              <w:rPr>
+                <w:sz w:val="19"/>
+              </w:rPr>
+            </w:r>
+            <w:r>
+              <w:rPr>
+                <w:sz w:val="19"/>
+              </w:rPr>
+              <w:t xml:space="preserve">Old </w:t>
+            </w:r>
+            <w:r>
+              <w:rPr>
+                <w:rFonts w:ascii="Consolas" w:hAnsi="Consolas"/>
+                <w:sz w:val="17"/>
+                <w:rFonts w:ascii="Consolas" w:hAnsi="Consolas"/>
+                <w:shd w:val="clear" w:color="auto" w:fill="F4F7F5"/>
+              </w:rPr>
+              <w:t>visit_*.png</w:t>
+            </w:r>
+            <w:r>
+              <w:rPr>
+                <w:sz w:val="19"/>
+              </w:rPr>
+              <w:t xml:space="preserve"> files persist in </w:t>
+            </w:r>
+            <w:r>
+              <w:rPr>
+                <w:rFonts w:ascii="Consolas" w:hAnsi="Consolas"/>
+                <w:sz w:val="17"/>
+                <w:rFonts w:ascii="Consolas" w:hAnsi="Consolas"/>
+                <w:shd w:val="clear" w:color="auto" w:fill="F4F7F5"/>
+              </w:rPr>
+              <w:t>static/img/</w:t>
+            </w:r>
+          </w:p>
+        </w:tc>
+      </w:tr>
+      <w:tr>
+        <w:tc>
+          <w:tcPr>
+            <w:tcW w:type="dxa" w:w="4824"/>
+          </w:tcPr>
+          <w:p>
+            <w:r>
+              <w:rPr>
+                <w:sz w:val="19"/>
+              </w:rPr>
+            </w:r>
+            <w:r>
+              <w:rPr>
+                <w:sz w:val="19"/>
+              </w:rPr>
+              <w:t xml:space="preserve">JS errors around </w:t>
+            </w:r>
+            <w:r>
+              <w:rPr>
+                <w:rFonts w:ascii="Consolas" w:hAnsi="Consolas"/>
+                <w:sz w:val="17"/>
+                <w:rFonts w:ascii="Consolas" w:hAnsi="Consolas"/>
+                <w:shd w:val="clear" w:color="auto" w:fill="F4F7F5"/>
+              </w:rPr>
+              <w:t>{% if %}</w:t>
+            </w:r>
+            <w:r>
+              <w:rPr>
+                <w:sz w:val="19"/>
+              </w:rPr>
+              <w:t xml:space="preserve"> in templates</w:t>
+            </w:r>
+          </w:p>
+        </w:tc>
+        <w:tc>
+          <w:tcPr>
+            <w:tcW w:type="dxa" w:w="4824"/>
+          </w:tcPr>
+          <w:p>
+            <w:r>
+              <w:rPr>
+                <w:sz w:val="19"/>
+              </w:rPr>
+            </w:r>
+            <w:r>
+              <w:rPr>
+                <w:sz w:val="19"/>
+              </w:rPr>
+              <w:t>The JS language server cannot parse Jinja; harmless</w:t>
+            </w:r>
+          </w:p>
+        </w:tc>
+      </w:tr>
+      <w:tr>
+        <w:tc>
+          <w:tcPr>
+            <w:tcW w:type="dxa" w:w="4824"/>
+          </w:tcPr>
+          <w:p>
+            <w:r>
+              <w:rPr>
+                <w:sz w:val="19"/>
+              </w:rPr>
+            </w:r>
+            <w:r>
+              <w:rPr>
+                <w:sz w:val="19"/>
+              </w:rPr>
+              <w:t>Login succeeds but lands somewhere unexpected</w:t>
+            </w:r>
+          </w:p>
+        </w:tc>
+        <w:tc>
+          <w:tcPr>
+            <w:tcW w:type="dxa" w:w="4824"/>
+          </w:tcPr>
+          <w:p>
+            <w:r>
+              <w:rPr>
+                <w:sz w:val="19"/>
+              </w:rPr>
+            </w:r>
+            <w:r>
+              <w:rPr>
+                <w:sz w:val="19"/>
+              </w:rPr>
+              <w:t xml:space="preserve">Check </w:t>
+            </w:r>
+            <w:r>
+              <w:rPr>
+                <w:rFonts w:ascii="Consolas" w:hAnsi="Consolas"/>
+                <w:sz w:val="17"/>
+                <w:rFonts w:ascii="Consolas" w:hAnsi="Consolas"/>
+                <w:shd w:val="clear" w:color="auto" w:fill="F4F7F5"/>
+              </w:rPr>
               <w:t>Role.landing_endpoint</w:t>
             </w:r>
             <w:r>
@@ -17475,6 +18168,121 @@
                 <w:sz w:val="19"/>
               </w:rPr>
               <w:t xml:space="preserve"> for that user's role</w:t>
+            </w:r>
+          </w:p>
+        </w:tc>
+      </w:tr>
+      <w:tr>
+        <w:tc>
+          <w:tcPr>
+            <w:tcW w:type="dxa" w:w="4824"/>
+          </w:tcPr>
+          <w:p>
+            <w:r>
+              <w:rPr>
+                <w:sz w:val="19"/>
+              </w:rPr>
+            </w:r>
+            <w:r>
+              <w:rPr>
+                <w:sz w:val="19"/>
+              </w:rPr>
+              <w:t xml:space="preserve">ngrok fails with </w:t>
+            </w:r>
+            <w:r>
+              <w:rPr>
+                <w:rFonts w:ascii="Consolas" w:hAnsi="Consolas"/>
+                <w:sz w:val="17"/>
+                <w:rFonts w:ascii="Consolas" w:hAnsi="Consolas"/>
+                <w:shd w:val="clear" w:color="auto" w:fill="F4F7F5"/>
+              </w:rPr>
+              <w:t>ERR_NGROK_334</w:t>
+            </w:r>
+          </w:p>
+        </w:tc>
+        <w:tc>
+          <w:tcPr>
+            <w:tcW w:type="dxa" w:w="4824"/>
+          </w:tcPr>
+          <w:p>
+            <w:r>
+              <w:rPr>
+                <w:sz w:val="19"/>
+              </w:rPr>
+            </w:r>
+            <w:r>
+              <w:rPr>
+                <w:sz w:val="19"/>
+              </w:rPr>
+              <w:t xml:space="preserve">A stale agent holds the reserved domain — </w:t>
+            </w:r>
+            <w:r>
+              <w:rPr>
+                <w:rFonts w:ascii="Consolas" w:hAnsi="Consolas"/>
+                <w:sz w:val="17"/>
+                <w:rFonts w:ascii="Consolas" w:hAnsi="Consolas"/>
+                <w:shd w:val="clear" w:color="auto" w:fill="F4F7F5"/>
+              </w:rPr>
+              <w:t>pkill -f ngrok</w:t>
+            </w:r>
+            <w:r>
+              <w:rPr>
+                <w:sz w:val="19"/>
+              </w:rPr>
+              <w:t>, then restart</w:t>
+            </w:r>
+          </w:p>
+        </w:tc>
+      </w:tr>
+      <w:tr>
+        <w:tc>
+          <w:tcPr>
+            <w:tcW w:type="dxa" w:w="4824"/>
+          </w:tcPr>
+          <w:p>
+            <w:r>
+              <w:rPr>
+                <w:sz w:val="19"/>
+              </w:rPr>
+            </w:r>
+            <w:r>
+              <w:rPr>
+                <w:sz w:val="19"/>
+              </w:rPr>
+              <w:t>ngrok tunnel "works" but the public URL 404s</w:t>
+            </w:r>
+          </w:p>
+        </w:tc>
+        <w:tc>
+          <w:tcPr>
+            <w:tcW w:type="dxa" w:w="4824"/>
+          </w:tcPr>
+          <w:p>
+            <w:r>
+              <w:rPr>
+                <w:sz w:val="19"/>
+              </w:rPr>
+            </w:r>
+            <w:r>
+              <w:rPr>
+                <w:sz w:val="19"/>
+              </w:rPr>
+              <w:t xml:space="preserve">The tunnel points at a dead port; check </w:t>
+            </w:r>
+            <w:r>
+              <w:rPr>
+                <w:rFonts w:ascii="Consolas" w:hAnsi="Consolas"/>
+                <w:sz w:val="17"/>
+                <w:rFonts w:ascii="Consolas" w:hAnsi="Consolas"/>
+                <w:shd w:val="clear" w:color="auto" w:fill="F4F7F5"/>
+              </w:rPr>
+              <w:t>PORT</w:t>
+            </w:r>
+            <w:r>
+              <w:rPr>
+                <w:sz w:val="19"/>
+              </w:rPr>
+              <w:t xml:space="preserve"> matches the running server</w:t>
             </w:r>
           </w:p>
         </w:tc>

</xml_diff>

<commit_message>
feat: make user rank a dropdown of standard NCS ranks
Replace the free-text rank field with a dropdown offering the standard
ranks: AC, CSC, DSC, SC, CA III, CA II, CA I, AIC, IC, ASC II, ASC I.

- NCS_RANKS defined once in app.py and passed to the template
- server-side validation rejects unknown ranks on create and update
- rank remains optional
- on edit, a stored rank that is no longer on the list is preserved and
  shown as '(existing)', so editing a user cannot silently wipe it
- the update endpoint accepts the user's own existing value, keeping
  legacy records editable

Regenerate the Word documentation.
</commit_message>
<xml_diff>
--- a/docs/TECHNICAL_DOCUMENTATION.docx
+++ b/docs/TECHNICAL_DOCUMENTATION.docx
@@ -4851,13 +4851,7 @@
                 <w:rFonts w:ascii="Consolas" w:hAnsi="Consolas"/>
                 <w:shd w:val="clear" w:color="auto" w:fill="F4F7F5"/>
               </w:rPr>
-              <w:t>Role.name</w:t>
-            </w:r>
-            <w:r>
-              <w:rPr>
-                <w:sz w:val="19"/>
-              </w:rPr>
-              <w:t xml:space="preserve"> (built-in)</w:t>
+              <w:t>User.rank</w:t>
             </w:r>
           </w:p>
         </w:tc>
@@ -4878,13 +4872,13 @@
                 <w:rFonts w:ascii="Consolas" w:hAnsi="Consolas"/>
                 <w:shd w:val="clear" w:color="auto" w:fill="F4F7F5"/>
               </w:rPr>
-              <w:t>Admin</w:t>
-            </w:r>
-            <w:r>
-              <w:rPr>
-                <w:sz w:val="19"/>
-              </w:rPr>
-              <w:t xml:space="preserve">, </w:t>
+              <w:t>NCS_RANKS</w:t>
+            </w:r>
+            <w:r>
+              <w:rPr>
+                <w:sz w:val="19"/>
+              </w:rPr>
+              <w:t xml:space="preserve"> in </w:t>
             </w:r>
             <w:r>
               <w:rPr>
@@ -4893,7 +4887,252 @@
                 <w:rFonts w:ascii="Consolas" w:hAnsi="Consolas"/>
                 <w:shd w:val="clear" w:color="auto" w:fill="F4F7F5"/>
               </w:rPr>
+              <w:t>app.py</w:t>
+            </w:r>
+            <w:r>
+              <w:rPr>
+                <w:sz w:val="19"/>
+              </w:rPr>
+              <w:t xml:space="preserve">: </w:t>
+            </w:r>
+            <w:r>
+              <w:rPr>
+                <w:rFonts w:ascii="Consolas" w:hAnsi="Consolas"/>
+                <w:sz w:val="17"/>
+                <w:rFonts w:ascii="Consolas" w:hAnsi="Consolas"/>
+                <w:shd w:val="clear" w:color="auto" w:fill="F4F7F5"/>
+              </w:rPr>
+              <w:t>AC</w:t>
+            </w:r>
+            <w:r>
+              <w:rPr>
+                <w:sz w:val="19"/>
+              </w:rPr>
+              <w:t xml:space="preserve">, </w:t>
+            </w:r>
+            <w:r>
+              <w:rPr>
+                <w:rFonts w:ascii="Consolas" w:hAnsi="Consolas"/>
+                <w:sz w:val="17"/>
+                <w:rFonts w:ascii="Consolas" w:hAnsi="Consolas"/>
+                <w:shd w:val="clear" w:color="auto" w:fill="F4F7F5"/>
+              </w:rPr>
+              <w:t>CSC</w:t>
+            </w:r>
+            <w:r>
+              <w:rPr>
+                <w:sz w:val="19"/>
+              </w:rPr>
+              <w:t xml:space="preserve">, </w:t>
+            </w:r>
+            <w:r>
+              <w:rPr>
+                <w:rFonts w:ascii="Consolas" w:hAnsi="Consolas"/>
+                <w:sz w:val="17"/>
+                <w:rFonts w:ascii="Consolas" w:hAnsi="Consolas"/>
+                <w:shd w:val="clear" w:color="auto" w:fill="F4F7F5"/>
+              </w:rPr>
+              <w:t>DSC</w:t>
+            </w:r>
+            <w:r>
+              <w:rPr>
+                <w:sz w:val="19"/>
+              </w:rPr>
+              <w:t xml:space="preserve">, </w:t>
+            </w:r>
+            <w:r>
+              <w:rPr>
+                <w:rFonts w:ascii="Consolas" w:hAnsi="Consolas"/>
+                <w:sz w:val="17"/>
+                <w:rFonts w:ascii="Consolas" w:hAnsi="Consolas"/>
+                <w:shd w:val="clear" w:color="auto" w:fill="F4F7F5"/>
+              </w:rPr>
+              <w:t>SC</w:t>
+            </w:r>
+            <w:r>
+              <w:rPr>
+                <w:sz w:val="19"/>
+              </w:rPr>
+              <w:t xml:space="preserve">, </w:t>
+            </w:r>
+            <w:r>
+              <w:rPr>
+                <w:rFonts w:ascii="Consolas" w:hAnsi="Consolas"/>
+                <w:sz w:val="17"/>
+                <w:rFonts w:ascii="Consolas" w:hAnsi="Consolas"/>
+                <w:shd w:val="clear" w:color="auto" w:fill="F4F7F5"/>
+              </w:rPr>
+              <w:t>CA III</w:t>
+            </w:r>
+            <w:r>
+              <w:rPr>
+                <w:sz w:val="19"/>
+              </w:rPr>
+              <w:t xml:space="preserve">, </w:t>
+            </w:r>
+            <w:r>
+              <w:rPr>
+                <w:rFonts w:ascii="Consolas" w:hAnsi="Consolas"/>
+                <w:sz w:val="17"/>
+                <w:rFonts w:ascii="Consolas" w:hAnsi="Consolas"/>
+                <w:shd w:val="clear" w:color="auto" w:fill="F4F7F5"/>
+              </w:rPr>
+              <w:t>CA II</w:t>
+            </w:r>
+            <w:r>
+              <w:rPr>
+                <w:sz w:val="19"/>
+              </w:rPr>
+              <w:t xml:space="preserve">, </w:t>
+            </w:r>
+            <w:r>
+              <w:rPr>
+                <w:rFonts w:ascii="Consolas" w:hAnsi="Consolas"/>
+                <w:sz w:val="17"/>
+                <w:rFonts w:ascii="Consolas" w:hAnsi="Consolas"/>
+                <w:shd w:val="clear" w:color="auto" w:fill="F4F7F5"/>
+              </w:rPr>
+              <w:t>CA I</w:t>
+            </w:r>
+            <w:r>
+              <w:rPr>
+                <w:sz w:val="19"/>
+              </w:rPr>
+              <w:t xml:space="preserve">, </w:t>
+            </w:r>
+            <w:r>
+              <w:rPr>
+                <w:rFonts w:ascii="Consolas" w:hAnsi="Consolas"/>
+                <w:sz w:val="17"/>
+                <w:rFonts w:ascii="Consolas" w:hAnsi="Consolas"/>
+                <w:shd w:val="clear" w:color="auto" w:fill="F4F7F5"/>
+              </w:rPr>
+              <w:t>AIC</w:t>
+            </w:r>
+            <w:r>
+              <w:rPr>
+                <w:sz w:val="19"/>
+              </w:rPr>
+              <w:t xml:space="preserve">, </w:t>
+            </w:r>
+            <w:r>
+              <w:rPr>
+                <w:rFonts w:ascii="Consolas" w:hAnsi="Consolas"/>
+                <w:sz w:val="17"/>
+                <w:rFonts w:ascii="Consolas" w:hAnsi="Consolas"/>
+                <w:shd w:val="clear" w:color="auto" w:fill="F4F7F5"/>
+              </w:rPr>
+              <w:t>IC</w:t>
+            </w:r>
+            <w:r>
+              <w:rPr>
+                <w:sz w:val="19"/>
+              </w:rPr>
+              <w:t xml:space="preserve">, </w:t>
+            </w:r>
+            <w:r>
+              <w:rPr>
+                <w:rFonts w:ascii="Consolas" w:hAnsi="Consolas"/>
+                <w:sz w:val="17"/>
+                <w:rFonts w:ascii="Consolas" w:hAnsi="Consolas"/>
+                <w:shd w:val="clear" w:color="auto" w:fill="F4F7F5"/>
+              </w:rPr>
+              <w:t>ASC II</w:t>
+            </w:r>
+            <w:r>
+              <w:rPr>
+                <w:sz w:val="19"/>
+              </w:rPr>
+              <w:t xml:space="preserve">, </w:t>
+            </w:r>
+            <w:r>
+              <w:rPr>
+                <w:rFonts w:ascii="Consolas" w:hAnsi="Consolas"/>
+                <w:sz w:val="17"/>
+                <w:rFonts w:ascii="Consolas" w:hAnsi="Consolas"/>
+                <w:shd w:val="clear" w:color="auto" w:fill="F4F7F5"/>
+              </w:rPr>
+              <w:t>ASC I</w:t>
+            </w:r>
+          </w:p>
+        </w:tc>
+      </w:tr>
+      <w:tr>
+        <w:tc>
+          <w:tcPr>
+            <w:tcW w:type="dxa" w:w="4824"/>
+          </w:tcPr>
+          <w:p>
+            <w:r>
+              <w:rPr>
+                <w:sz w:val="19"/>
+              </w:rPr>
+            </w:r>
+            <w:r>
+              <w:rPr>
+                <w:rFonts w:ascii="Consolas" w:hAnsi="Consolas"/>
+                <w:sz w:val="17"/>
+                <w:rFonts w:ascii="Consolas" w:hAnsi="Consolas"/>
+                <w:shd w:val="clear" w:color="auto" w:fill="F4F7F5"/>
+              </w:rPr>
+              <w:t>Role.name</w:t>
+            </w:r>
+            <w:r>
+              <w:rPr>
+                <w:sz w:val="19"/>
+              </w:rPr>
+              <w:t xml:space="preserve"> (built-in)</w:t>
+            </w:r>
+          </w:p>
+        </w:tc>
+        <w:tc>
+          <w:tcPr>
+            <w:tcW w:type="dxa" w:w="4824"/>
+          </w:tcPr>
+          <w:p>
+            <w:r>
+              <w:rPr>
+                <w:sz w:val="19"/>
+              </w:rPr>
+            </w:r>
+            <w:r>
+              <w:rPr>
+                <w:rFonts w:ascii="Consolas" w:hAnsi="Consolas"/>
+                <w:sz w:val="17"/>
+                <w:rFonts w:ascii="Consolas" w:hAnsi="Consolas"/>
+                <w:shd w:val="clear" w:color="auto" w:fill="F4F7F5"/>
+              </w:rPr>
+              <w:t>Admin</w:t>
+            </w:r>
+            <w:r>
+              <w:rPr>
+                <w:sz w:val="19"/>
+              </w:rPr>
+              <w:t xml:space="preserve">, </w:t>
+            </w:r>
+            <w:r>
+              <w:rPr>
+                <w:rFonts w:ascii="Consolas" w:hAnsi="Consolas"/>
+                <w:sz w:val="17"/>
+                <w:rFonts w:ascii="Consolas" w:hAnsi="Consolas"/>
+                <w:shd w:val="clear" w:color="auto" w:fill="F4F7F5"/>
+              </w:rPr>
               <w:t>Officer</w:t>
+            </w:r>
+            <w:r>
+              <w:rPr>
+                <w:sz w:val="19"/>
+              </w:rPr>
+              <w:t xml:space="preserve">, </w:t>
+            </w:r>
+            <w:r>
+              <w:rPr>
+                <w:rFonts w:ascii="Consolas" w:hAnsi="Consolas"/>
+                <w:sz w:val="17"/>
+                <w:rFonts w:ascii="Consolas" w:hAnsi="Consolas"/>
+                <w:shd w:val="clear" w:color="auto" w:fill="F4F7F5"/>
+              </w:rPr>
+              <w:t>Department</w:t>
             </w:r>
           </w:p>
         </w:tc>

</xml_diff>